<commit_message>
feat: Add exact docx topics, 31 August scheduling and score entry modal
</commit_message>
<xml_diff>
--- a/biyoloji.docx
+++ b/biyoloji.docx
@@ -4,885 +4,1245 @@
   <w:body>
     <w:p>
       <w:pPr>
-        <w:numPr>
-          <w:ilvl w:val="0"/>
-          <w:numId w:val="1"/>
-        </w:numPr>
-      </w:pPr>
-      <w:r>
+        <w:rPr>
+          <w:b/>
+          <w:bCs/>
+        </w:rPr>
+      </w:pPr>
+      <w:r>
+        <w:rPr>
+          <w:b/>
+          <w:bCs/>
+        </w:rPr>
+        <w:t xml:space="preserve">Dr. Biyoloji | </w:t>
+      </w:r>
+      <w:proofErr w:type="gramStart"/>
+      <w:r>
+        <w:rPr>
+          <w:b/>
+          <w:bCs/>
+        </w:rPr>
+        <w:t>2026 -</w:t>
+      </w:r>
+      <w:proofErr w:type="gramEnd"/>
+      <w:r>
+        <w:rPr>
+          <w:b/>
+          <w:bCs/>
+        </w:rPr>
+        <w:t xml:space="preserve"> 2027 Dönemi Oynatma Listesi</w:t>
+      </w:r>
+    </w:p>
+    <w:p>
+      <w:pPr>
+        <w:numPr>
+          <w:ilvl w:val="0"/>
+          <w:numId w:val="2"/>
+        </w:numPr>
+      </w:pPr>
+      <w:r>
+        <w:rPr>
+          <w:b/>
+          <w:bCs/>
+        </w:rPr>
+        <w:t>Canlıların Karakteristik Özellikleri</w:t>
+      </w:r>
+      <w:r>
+        <w:t xml:space="preserve"> (10:23)</w:t>
+      </w:r>
+    </w:p>
+    <w:p>
+      <w:pPr>
+        <w:numPr>
+          <w:ilvl w:val="0"/>
+          <w:numId w:val="2"/>
+        </w:numPr>
+      </w:pPr>
+      <w:r>
+        <w:rPr>
+          <w:b/>
+          <w:bCs/>
+        </w:rPr>
+        <w:t>Virüsler</w:t>
+      </w:r>
+      <w:r>
+        <w:t xml:space="preserve"> (17:39)</w:t>
+      </w:r>
+    </w:p>
+    <w:p>
+      <w:pPr>
+        <w:numPr>
+          <w:ilvl w:val="0"/>
+          <w:numId w:val="2"/>
+        </w:numPr>
+      </w:pPr>
+      <w:r>
+        <w:rPr>
+          <w:b/>
+          <w:bCs/>
+        </w:rPr>
+        <w:t xml:space="preserve">Canlıların Karakteristik Özellikleri ve Virüsler </w:t>
+      </w:r>
+      <w:proofErr w:type="spellStart"/>
+      <w:r>
+        <w:rPr>
+          <w:b/>
+          <w:bCs/>
+        </w:rPr>
+        <w:t>Checkpoint</w:t>
+      </w:r>
+      <w:proofErr w:type="spellEnd"/>
+      <w:r>
+        <w:t xml:space="preserve"> (9:31)</w:t>
+      </w:r>
+    </w:p>
+    <w:p>
+      <w:pPr>
+        <w:numPr>
+          <w:ilvl w:val="0"/>
+          <w:numId w:val="2"/>
+        </w:numPr>
+      </w:pPr>
+      <w:r>
+        <w:rPr>
+          <w:b/>
+          <w:bCs/>
+        </w:rPr>
+        <w:t>Mineraller</w:t>
+      </w:r>
+      <w:r>
+        <w:t xml:space="preserve"> (13:19)</w:t>
+      </w:r>
+    </w:p>
+    <w:p>
+      <w:pPr>
+        <w:numPr>
+          <w:ilvl w:val="0"/>
+          <w:numId w:val="2"/>
+        </w:numPr>
+      </w:pPr>
+      <w:r>
+        <w:rPr>
+          <w:b/>
+          <w:bCs/>
+        </w:rPr>
+        <w:t>Su, Asit-Baz ve Tuz</w:t>
+      </w:r>
+      <w:r>
+        <w:t xml:space="preserve"> (14:31)</w:t>
+      </w:r>
+    </w:p>
+    <w:p>
+      <w:pPr>
+        <w:numPr>
+          <w:ilvl w:val="0"/>
+          <w:numId w:val="2"/>
+        </w:numPr>
+      </w:pPr>
+      <w:r>
+        <w:rPr>
+          <w:b/>
+          <w:bCs/>
+        </w:rPr>
+        <w:t xml:space="preserve">İnorganik Bileşikler </w:t>
+      </w:r>
+      <w:proofErr w:type="spellStart"/>
+      <w:r>
+        <w:rPr>
+          <w:b/>
+          <w:bCs/>
+        </w:rPr>
+        <w:t>Checkpoint</w:t>
+      </w:r>
+      <w:proofErr w:type="spellEnd"/>
+      <w:r>
+        <w:t xml:space="preserve"> (20:58)</w:t>
+      </w:r>
+    </w:p>
+    <w:p>
+      <w:pPr>
+        <w:numPr>
+          <w:ilvl w:val="0"/>
+          <w:numId w:val="2"/>
+        </w:numPr>
+      </w:pPr>
+      <w:r>
+        <w:rPr>
+          <w:b/>
+          <w:bCs/>
+        </w:rPr>
+        <w:t>Karbohidratlar</w:t>
+      </w:r>
+      <w:r>
+        <w:t xml:space="preserve"> (11:43)</w:t>
+      </w:r>
+    </w:p>
+    <w:p>
+      <w:pPr>
+        <w:numPr>
+          <w:ilvl w:val="0"/>
+          <w:numId w:val="2"/>
+        </w:numPr>
+      </w:pPr>
+      <w:proofErr w:type="gramStart"/>
+      <w:r>
+        <w:rPr>
+          <w:b/>
+          <w:bCs/>
+        </w:rPr>
+        <w:t>Lipitler -</w:t>
+      </w:r>
+      <w:proofErr w:type="gramEnd"/>
+      <w:r>
+        <w:rPr>
+          <w:b/>
+          <w:bCs/>
+        </w:rPr>
+        <w:t xml:space="preserve"> Yağlar</w:t>
+      </w:r>
+      <w:r>
+        <w:t xml:space="preserve"> (13:35)</w:t>
+      </w:r>
+    </w:p>
+    <w:p>
+      <w:pPr>
+        <w:numPr>
+          <w:ilvl w:val="0"/>
+          <w:numId w:val="2"/>
+        </w:numPr>
+      </w:pPr>
+      <w:r>
+        <w:rPr>
+          <w:b/>
+          <w:bCs/>
+        </w:rPr>
+        <w:t>Proteinler</w:t>
+      </w:r>
+      <w:r>
+        <w:t xml:space="preserve"> (17:17)</w:t>
+      </w:r>
+    </w:p>
+    <w:p>
+      <w:pPr>
+        <w:numPr>
+          <w:ilvl w:val="0"/>
+          <w:numId w:val="2"/>
+        </w:numPr>
+      </w:pPr>
+      <w:r>
+        <w:rPr>
+          <w:b/>
+          <w:bCs/>
+        </w:rPr>
+        <w:t xml:space="preserve">Organik Bileşikler </w:t>
+      </w:r>
+      <w:proofErr w:type="spellStart"/>
+      <w:r>
+        <w:rPr>
+          <w:b/>
+          <w:bCs/>
+        </w:rPr>
+        <w:t>Checkpoint</w:t>
+      </w:r>
+      <w:proofErr w:type="spellEnd"/>
+      <w:r>
+        <w:t xml:space="preserve"> (19:07)</w:t>
+      </w:r>
+    </w:p>
+    <w:p>
+      <w:pPr>
+        <w:numPr>
+          <w:ilvl w:val="0"/>
+          <w:numId w:val="2"/>
+        </w:numPr>
+      </w:pPr>
+      <w:r>
+        <w:rPr>
+          <w:b/>
+          <w:bCs/>
+        </w:rPr>
+        <w:t>Enzimler 1. Kısım</w:t>
+      </w:r>
+      <w:r>
+        <w:t xml:space="preserve"> (15:55)</w:t>
+      </w:r>
+    </w:p>
+    <w:p>
+      <w:pPr>
+        <w:numPr>
+          <w:ilvl w:val="0"/>
+          <w:numId w:val="2"/>
+        </w:numPr>
+      </w:pPr>
+      <w:r>
+        <w:rPr>
+          <w:b/>
+          <w:bCs/>
+        </w:rPr>
+        <w:t>Enzimler 2. Kısım</w:t>
+      </w:r>
+      <w:r>
+        <w:t xml:space="preserve"> (7:53)</w:t>
+      </w:r>
+    </w:p>
+    <w:p>
+      <w:pPr>
+        <w:numPr>
+          <w:ilvl w:val="0"/>
+          <w:numId w:val="2"/>
+        </w:numPr>
+      </w:pPr>
+      <w:r>
+        <w:rPr>
+          <w:b/>
+          <w:bCs/>
+        </w:rPr>
+        <w:t>Vitaminler</w:t>
+      </w:r>
+      <w:r>
+        <w:t xml:space="preserve"> (13:59)</w:t>
+      </w:r>
+    </w:p>
+    <w:p>
+      <w:pPr>
+        <w:numPr>
+          <w:ilvl w:val="0"/>
+          <w:numId w:val="2"/>
+        </w:numPr>
+      </w:pPr>
+      <w:r>
+        <w:rPr>
+          <w:b/>
+          <w:bCs/>
+        </w:rPr>
         <w:t xml:space="preserve">Enzimler ve Vitaminler </w:t>
       </w:r>
       <w:proofErr w:type="spellStart"/>
       <w:r>
+        <w:rPr>
+          <w:b/>
+          <w:bCs/>
+        </w:rPr>
         <w:t>Checkpoint</w:t>
       </w:r>
       <w:proofErr w:type="spellEnd"/>
       <w:r>
-        <w:t xml:space="preserve"> | Biyoloji 2026-2027 | Dr. Biyoloji</w:t>
-      </w:r>
-    </w:p>
-    <w:p>
-      <w:pPr>
-        <w:numPr>
-          <w:ilvl w:val="0"/>
-          <w:numId w:val="1"/>
-        </w:numPr>
-      </w:pPr>
-      <w:r>
-        <w:t xml:space="preserve">Nükleik Asitler DNA ve RNA | Dr. Biyoloji | Dönem </w:t>
+        <w:t xml:space="preserve"> (15:44)</w:t>
+      </w:r>
+    </w:p>
+    <w:p>
+      <w:pPr>
+        <w:numPr>
+          <w:ilvl w:val="0"/>
+          <w:numId w:val="2"/>
+        </w:numPr>
+      </w:pPr>
+      <w:r>
+        <w:rPr>
+          <w:b/>
+          <w:bCs/>
+        </w:rPr>
+        <w:t>Nükleik Asitler DNA ve RNA</w:t>
+      </w:r>
+      <w:r>
+        <w:t xml:space="preserve"> (14:05)</w:t>
+      </w:r>
+    </w:p>
+    <w:p>
+      <w:pPr>
+        <w:numPr>
+          <w:ilvl w:val="0"/>
+          <w:numId w:val="2"/>
+        </w:numPr>
+      </w:pPr>
+      <w:r>
+        <w:rPr>
+          <w:b/>
+          <w:bCs/>
+        </w:rPr>
+        <w:t>ATP ve Metabolizma</w:t>
+      </w:r>
+      <w:r>
+        <w:t xml:space="preserve"> (18:39)</w:t>
+      </w:r>
+    </w:p>
+    <w:p>
+      <w:pPr>
+        <w:numPr>
+          <w:ilvl w:val="0"/>
+          <w:numId w:val="2"/>
+        </w:numPr>
+      </w:pPr>
+      <w:r>
+        <w:rPr>
+          <w:b/>
+          <w:bCs/>
+        </w:rPr>
+        <w:t xml:space="preserve">Nükleik Asitler ve ATP </w:t>
+      </w:r>
+      <w:proofErr w:type="spellStart"/>
+      <w:r>
+        <w:rPr>
+          <w:b/>
+          <w:bCs/>
+        </w:rPr>
+        <w:t>Checkpoint</w:t>
+      </w:r>
+      <w:proofErr w:type="spellEnd"/>
+      <w:r>
+        <w:t xml:space="preserve"> (27:15)</w:t>
+      </w:r>
+    </w:p>
+    <w:p>
+      <w:pPr>
+        <w:numPr>
+          <w:ilvl w:val="0"/>
+          <w:numId w:val="2"/>
+        </w:numPr>
+      </w:pPr>
+      <w:r>
+        <w:rPr>
+          <w:b/>
+          <w:bCs/>
+        </w:rPr>
+        <w:t>Hücre Organelleri 1.Kısım</w:t>
+      </w:r>
+      <w:r>
+        <w:t xml:space="preserve"> (14:02)</w:t>
+      </w:r>
+    </w:p>
+    <w:p>
+      <w:pPr>
+        <w:numPr>
+          <w:ilvl w:val="0"/>
+          <w:numId w:val="2"/>
+        </w:numPr>
+      </w:pPr>
+      <w:r>
+        <w:rPr>
+          <w:b/>
+          <w:bCs/>
+        </w:rPr>
+        <w:t>Hücre Organelleri 2.Kısım</w:t>
+      </w:r>
+      <w:r>
+        <w:t xml:space="preserve"> (18:35)</w:t>
+      </w:r>
+    </w:p>
+    <w:p>
+      <w:pPr>
+        <w:numPr>
+          <w:ilvl w:val="0"/>
+          <w:numId w:val="2"/>
+        </w:numPr>
+      </w:pPr>
+      <w:r>
+        <w:rPr>
+          <w:b/>
+          <w:bCs/>
+        </w:rPr>
+        <w:t xml:space="preserve">Organeller </w:t>
+      </w:r>
+      <w:proofErr w:type="spellStart"/>
+      <w:r>
+        <w:rPr>
+          <w:b/>
+          <w:bCs/>
+        </w:rPr>
+        <w:t>Checkpoint</w:t>
+      </w:r>
+      <w:proofErr w:type="spellEnd"/>
+      <w:r>
+        <w:t xml:space="preserve"> (27:50)</w:t>
+      </w:r>
+    </w:p>
+    <w:p>
+      <w:pPr>
+        <w:numPr>
+          <w:ilvl w:val="0"/>
+          <w:numId w:val="2"/>
+        </w:numPr>
+      </w:pPr>
+      <w:r>
+        <w:rPr>
+          <w:b/>
+          <w:bCs/>
+        </w:rPr>
+        <w:t>Hücre Zarında Madde Alışverişleri 1.Kısım</w:t>
+      </w:r>
+      <w:r>
+        <w:t xml:space="preserve"> (7:31)</w:t>
+      </w:r>
+    </w:p>
+    <w:p>
+      <w:pPr>
+        <w:numPr>
+          <w:ilvl w:val="0"/>
+          <w:numId w:val="2"/>
+        </w:numPr>
+      </w:pPr>
+      <w:r>
+        <w:rPr>
+          <w:b/>
+          <w:bCs/>
+        </w:rPr>
+        <w:t>Hücre Zarında Madde Alışverişleri 2.Kısım</w:t>
+      </w:r>
+      <w:r>
+        <w:t xml:space="preserve"> (7:34)</w:t>
+      </w:r>
+    </w:p>
+    <w:p>
+      <w:pPr>
+        <w:numPr>
+          <w:ilvl w:val="0"/>
+          <w:numId w:val="2"/>
+        </w:numPr>
+      </w:pPr>
+      <w:r>
+        <w:rPr>
+          <w:b/>
+          <w:bCs/>
+        </w:rPr>
+        <w:t>Bilimsel Yöntem ve Çalışma Basamakları</w:t>
+      </w:r>
+      <w:r>
+        <w:t xml:space="preserve"> (18:39)</w:t>
+      </w:r>
+    </w:p>
+    <w:p>
+      <w:pPr>
+        <w:numPr>
+          <w:ilvl w:val="0"/>
+          <w:numId w:val="2"/>
+        </w:numPr>
+      </w:pPr>
+      <w:r>
+        <w:rPr>
+          <w:b/>
+          <w:bCs/>
+        </w:rPr>
+        <w:t xml:space="preserve">Hücre Zarı ve Bilimsel Çalışma </w:t>
+      </w:r>
+      <w:proofErr w:type="spellStart"/>
+      <w:r>
+        <w:rPr>
+          <w:b/>
+          <w:bCs/>
+        </w:rPr>
+        <w:t>Checkpoint</w:t>
+      </w:r>
+      <w:proofErr w:type="spellEnd"/>
+      <w:r>
+        <w:t xml:space="preserve"> (15:05)</w:t>
+      </w:r>
+    </w:p>
+    <w:p>
+      <w:pPr>
+        <w:numPr>
+          <w:ilvl w:val="0"/>
+          <w:numId w:val="2"/>
+        </w:numPr>
+      </w:pPr>
+      <w:r>
+        <w:rPr>
+          <w:b/>
+          <w:bCs/>
+        </w:rPr>
+        <w:t>Canlıların Sınıflandırılması</w:t>
+      </w:r>
+      <w:r>
+        <w:t xml:space="preserve"> (16:39)</w:t>
+      </w:r>
+    </w:p>
+    <w:p>
+      <w:pPr>
+        <w:numPr>
+          <w:ilvl w:val="0"/>
+          <w:numId w:val="2"/>
+        </w:numPr>
+      </w:pPr>
+      <w:r>
+        <w:rPr>
+          <w:b/>
+          <w:bCs/>
+        </w:rPr>
+        <w:t>Bakteri ve Arke</w:t>
+      </w:r>
+      <w:r>
+        <w:t xml:space="preserve"> (13:00)</w:t>
+      </w:r>
+    </w:p>
+    <w:p>
+      <w:pPr>
+        <w:numPr>
+          <w:ilvl w:val="0"/>
+          <w:numId w:val="2"/>
+        </w:numPr>
+      </w:pPr>
+      <w:r>
+        <w:rPr>
+          <w:b/>
+          <w:bCs/>
+        </w:rPr>
+        <w:t xml:space="preserve">Bakteri ve Arke </w:t>
+      </w:r>
+      <w:proofErr w:type="spellStart"/>
+      <w:r>
+        <w:rPr>
+          <w:b/>
+          <w:bCs/>
+        </w:rPr>
+        <w:t>Checkpoint</w:t>
+      </w:r>
+      <w:proofErr w:type="spellEnd"/>
+      <w:r>
+        <w:t xml:space="preserve"> (7:34)</w:t>
+      </w:r>
+    </w:p>
+    <w:p>
+      <w:pPr>
+        <w:numPr>
+          <w:ilvl w:val="0"/>
+          <w:numId w:val="2"/>
+        </w:numPr>
+      </w:pPr>
+      <w:proofErr w:type="spellStart"/>
+      <w:r>
+        <w:rPr>
+          <w:b/>
+          <w:bCs/>
+        </w:rPr>
+        <w:lastRenderedPageBreak/>
+        <w:t>Protista</w:t>
+      </w:r>
+      <w:proofErr w:type="spellEnd"/>
+      <w:r>
+        <w:t xml:space="preserve"> (7:38)</w:t>
+      </w:r>
+    </w:p>
+    <w:p>
+      <w:pPr>
+        <w:numPr>
+          <w:ilvl w:val="0"/>
+          <w:numId w:val="2"/>
+        </w:numPr>
+      </w:pPr>
+      <w:r>
+        <w:rPr>
+          <w:b/>
+          <w:bCs/>
+        </w:rPr>
+        <w:t>Bitki</w:t>
+      </w:r>
+      <w:r>
+        <w:t xml:space="preserve"> (4:35)</w:t>
+      </w:r>
+    </w:p>
+    <w:p>
+      <w:pPr>
+        <w:numPr>
+          <w:ilvl w:val="0"/>
+          <w:numId w:val="2"/>
+        </w:numPr>
+      </w:pPr>
+      <w:r>
+        <w:rPr>
+          <w:b/>
+          <w:bCs/>
+        </w:rPr>
+        <w:t>Mantar</w:t>
+      </w:r>
+      <w:r>
+        <w:t xml:space="preserve"> (14:00)</w:t>
+      </w:r>
+    </w:p>
+    <w:p>
+      <w:pPr>
+        <w:numPr>
+          <w:ilvl w:val="0"/>
+          <w:numId w:val="2"/>
+        </w:numPr>
+      </w:pPr>
+      <w:proofErr w:type="spellStart"/>
+      <w:r>
+        <w:rPr>
+          <w:b/>
+          <w:bCs/>
+        </w:rPr>
+        <w:t>Protista</w:t>
+      </w:r>
+      <w:proofErr w:type="spellEnd"/>
+      <w:r>
+        <w:rPr>
+          <w:b/>
+          <w:bCs/>
+        </w:rPr>
+        <w:t xml:space="preserve">, Bitki ve Mantar </w:t>
+      </w:r>
+      <w:proofErr w:type="spellStart"/>
+      <w:r>
+        <w:rPr>
+          <w:b/>
+          <w:bCs/>
+        </w:rPr>
+        <w:t>Checkpoint</w:t>
+      </w:r>
+      <w:proofErr w:type="spellEnd"/>
+      <w:r>
+        <w:t xml:space="preserve"> (11:48)</w:t>
+      </w:r>
+    </w:p>
+    <w:p>
+      <w:pPr>
+        <w:numPr>
+          <w:ilvl w:val="0"/>
+          <w:numId w:val="2"/>
+        </w:numPr>
+      </w:pPr>
+      <w:r>
+        <w:rPr>
+          <w:b/>
+          <w:bCs/>
+        </w:rPr>
+        <w:t>Omurgasızlar</w:t>
+      </w:r>
+      <w:r>
+        <w:t xml:space="preserve"> (12:55)</w:t>
+      </w:r>
+    </w:p>
+    <w:p>
+      <w:pPr>
+        <w:numPr>
+          <w:ilvl w:val="0"/>
+          <w:numId w:val="2"/>
+        </w:numPr>
+      </w:pPr>
+      <w:r>
+        <w:rPr>
+          <w:b/>
+          <w:bCs/>
+        </w:rPr>
+        <w:t>Omurgalılar</w:t>
+      </w:r>
+      <w:r>
+        <w:t xml:space="preserve"> (15:23)</w:t>
+      </w:r>
+    </w:p>
+    <w:p>
+      <w:pPr>
+        <w:numPr>
+          <w:ilvl w:val="0"/>
+          <w:numId w:val="2"/>
+        </w:numPr>
+      </w:pPr>
+      <w:r>
+        <w:rPr>
+          <w:b/>
+          <w:bCs/>
+        </w:rPr>
+        <w:t xml:space="preserve">Hayvanlar </w:t>
+      </w:r>
+      <w:proofErr w:type="spellStart"/>
+      <w:r>
+        <w:rPr>
+          <w:b/>
+          <w:bCs/>
+        </w:rPr>
+        <w:t>Checkpoint</w:t>
+      </w:r>
+      <w:proofErr w:type="spellEnd"/>
+      <w:r>
+        <w:t xml:space="preserve"> (22:38)</w:t>
+      </w:r>
+    </w:p>
+    <w:p>
+      <w:pPr>
+        <w:numPr>
+          <w:ilvl w:val="0"/>
+          <w:numId w:val="2"/>
+        </w:numPr>
+      </w:pPr>
+      <w:r>
+        <w:rPr>
+          <w:b/>
+          <w:bCs/>
+        </w:rPr>
+        <w:t xml:space="preserve">Hücre </w:t>
       </w:r>
       <w:proofErr w:type="gramStart"/>
       <w:r>
-        <w:t>2026 -</w:t>
+        <w:rPr>
+          <w:b/>
+          <w:bCs/>
+        </w:rPr>
+        <w:t>Bölünmeleri -</w:t>
       </w:r>
       <w:proofErr w:type="gramEnd"/>
       <w:r>
-        <w:t xml:space="preserve"> 2027</w:t>
-      </w:r>
-    </w:p>
-    <w:p>
-      <w:pPr>
-        <w:numPr>
-          <w:ilvl w:val="0"/>
-          <w:numId w:val="1"/>
-        </w:numPr>
-      </w:pPr>
-      <w:r>
-        <w:t xml:space="preserve">ATP ve Metabolizma | Dr. Biyoloji | Dönem </w:t>
+        <w:rPr>
+          <w:b/>
+          <w:bCs/>
+        </w:rPr>
+        <w:t xml:space="preserve"> Mitoz</w:t>
+      </w:r>
+      <w:r>
+        <w:t xml:space="preserve"> (15:06)</w:t>
+      </w:r>
+    </w:p>
+    <w:p>
+      <w:pPr>
+        <w:numPr>
+          <w:ilvl w:val="0"/>
+          <w:numId w:val="2"/>
+        </w:numPr>
+      </w:pPr>
+      <w:r>
+        <w:rPr>
+          <w:b/>
+          <w:bCs/>
+        </w:rPr>
+        <w:t xml:space="preserve">Mitoz </w:t>
+      </w:r>
+      <w:proofErr w:type="spellStart"/>
+      <w:r>
+        <w:rPr>
+          <w:b/>
+          <w:bCs/>
+        </w:rPr>
+        <w:t>Checkpoint</w:t>
+      </w:r>
+      <w:proofErr w:type="spellEnd"/>
+      <w:r>
+        <w:t xml:space="preserve"> (10:15)</w:t>
+      </w:r>
+    </w:p>
+    <w:p>
+      <w:pPr>
+        <w:numPr>
+          <w:ilvl w:val="0"/>
+          <w:numId w:val="2"/>
+        </w:numPr>
+      </w:pPr>
+      <w:r>
+        <w:rPr>
+          <w:b/>
+          <w:bCs/>
+        </w:rPr>
+        <w:t xml:space="preserve">Hücre </w:t>
       </w:r>
       <w:proofErr w:type="gramStart"/>
       <w:r>
-        <w:t>2026 -</w:t>
+        <w:rPr>
+          <w:b/>
+          <w:bCs/>
+        </w:rPr>
+        <w:t>Bölünmeleri -</w:t>
       </w:r>
       <w:proofErr w:type="gramEnd"/>
       <w:r>
-        <w:t xml:space="preserve"> 2027</w:t>
-      </w:r>
-    </w:p>
-    <w:p>
-      <w:pPr>
-        <w:numPr>
-          <w:ilvl w:val="0"/>
-          <w:numId w:val="1"/>
-        </w:numPr>
-      </w:pPr>
-      <w:r>
-        <w:t xml:space="preserve">Nükleik Asitler ve ATP </w:t>
+        <w:rPr>
+          <w:b/>
+          <w:bCs/>
+        </w:rPr>
+        <w:t xml:space="preserve"> Mayoz</w:t>
+      </w:r>
+      <w:r>
+        <w:t xml:space="preserve"> (18:32)</w:t>
+      </w:r>
+    </w:p>
+    <w:p>
+      <w:pPr>
+        <w:numPr>
+          <w:ilvl w:val="0"/>
+          <w:numId w:val="2"/>
+        </w:numPr>
+      </w:pPr>
+      <w:r>
+        <w:rPr>
+          <w:b/>
+          <w:bCs/>
+        </w:rPr>
+        <w:t xml:space="preserve">Mayoz </w:t>
       </w:r>
       <w:proofErr w:type="spellStart"/>
       <w:r>
+        <w:rPr>
+          <w:b/>
+          <w:bCs/>
+        </w:rPr>
         <w:t>Checkpoint</w:t>
       </w:r>
       <w:proofErr w:type="spellEnd"/>
       <w:r>
-        <w:t xml:space="preserve"> | Biyoloji 2026-2027 | Dr. Biyoloji</w:t>
-      </w:r>
-    </w:p>
-    <w:p>
-      <w:pPr>
-        <w:numPr>
-          <w:ilvl w:val="0"/>
-          <w:numId w:val="1"/>
-        </w:numPr>
-      </w:pPr>
-      <w:r>
-        <w:t xml:space="preserve">Hücre Organelleri 1.Kısım | Dr. Biyoloji | Dönem </w:t>
-      </w:r>
-      <w:proofErr w:type="gramStart"/>
-      <w:r>
-        <w:t>2026 -</w:t>
-      </w:r>
-      <w:proofErr w:type="gramEnd"/>
-      <w:r>
-        <w:t xml:space="preserve"> 2027</w:t>
-      </w:r>
-    </w:p>
-    <w:p>
-      <w:pPr>
-        <w:numPr>
-          <w:ilvl w:val="0"/>
-          <w:numId w:val="1"/>
-        </w:numPr>
-      </w:pPr>
-      <w:r>
-        <w:t xml:space="preserve">Hücre Organelleri 2.Kısım | Dr. Biyoloji | Dönem </w:t>
-      </w:r>
-      <w:proofErr w:type="gramStart"/>
-      <w:r>
-        <w:t>2026 -</w:t>
-      </w:r>
-      <w:proofErr w:type="gramEnd"/>
-      <w:r>
-        <w:t xml:space="preserve"> 2027</w:t>
-      </w:r>
-    </w:p>
-    <w:p>
-      <w:pPr>
-        <w:numPr>
-          <w:ilvl w:val="0"/>
-          <w:numId w:val="1"/>
-        </w:numPr>
-      </w:pPr>
-      <w:r>
-        <w:t xml:space="preserve">Organeller </w:t>
+        <w:t xml:space="preserve"> (20:19)</w:t>
+      </w:r>
+    </w:p>
+    <w:p>
+      <w:pPr>
+        <w:numPr>
+          <w:ilvl w:val="0"/>
+          <w:numId w:val="2"/>
+        </w:numPr>
+      </w:pPr>
+      <w:r>
+        <w:rPr>
+          <w:b/>
+          <w:bCs/>
+        </w:rPr>
+        <w:t>Eşeysiz Üreme</w:t>
+      </w:r>
+      <w:r>
+        <w:t xml:space="preserve"> (10:46)</w:t>
+      </w:r>
+    </w:p>
+    <w:p>
+      <w:pPr>
+        <w:numPr>
+          <w:ilvl w:val="0"/>
+          <w:numId w:val="2"/>
+        </w:numPr>
+      </w:pPr>
+      <w:r>
+        <w:rPr>
+          <w:b/>
+          <w:bCs/>
+        </w:rPr>
+        <w:t>Eşeyli Üreme</w:t>
+      </w:r>
+      <w:r>
+        <w:t xml:space="preserve"> (14:55)</w:t>
+      </w:r>
+    </w:p>
+    <w:p>
+      <w:pPr>
+        <w:numPr>
+          <w:ilvl w:val="0"/>
+          <w:numId w:val="2"/>
+        </w:numPr>
+      </w:pPr>
+      <w:r>
+        <w:rPr>
+          <w:b/>
+          <w:bCs/>
+        </w:rPr>
+        <w:t xml:space="preserve">Eşeysiz ve Eşeyli Üreme </w:t>
       </w:r>
       <w:proofErr w:type="spellStart"/>
       <w:r>
+        <w:rPr>
+          <w:b/>
+          <w:bCs/>
+        </w:rPr>
         <w:t>Checkpoint</w:t>
       </w:r>
       <w:proofErr w:type="spellEnd"/>
       <w:r>
-        <w:t xml:space="preserve"> | Biyoloji 2026-2027 | Dr. Biyoloji</w:t>
-      </w:r>
-    </w:p>
-    <w:p>
-      <w:pPr>
-        <w:numPr>
-          <w:ilvl w:val="0"/>
-          <w:numId w:val="1"/>
-        </w:numPr>
-      </w:pPr>
-      <w:r>
-        <w:t xml:space="preserve">Hücre Zarında Madde Alışverişleri 1.Kısım | Dr. Biyoloji | Dönem </w:t>
-      </w:r>
-      <w:proofErr w:type="gramStart"/>
-      <w:r>
-        <w:t>2026 -</w:t>
-      </w:r>
-      <w:proofErr w:type="gramEnd"/>
-      <w:r>
-        <w:t xml:space="preserve"> 2027</w:t>
-      </w:r>
-    </w:p>
-    <w:p>
-      <w:pPr>
-        <w:numPr>
-          <w:ilvl w:val="0"/>
-          <w:numId w:val="1"/>
-        </w:numPr>
-      </w:pPr>
-      <w:r>
-        <w:t xml:space="preserve">Hücre Zarında Madde Alışverişleri 2.Kısım | Dr. Biyoloji | Dönem </w:t>
-      </w:r>
-      <w:proofErr w:type="gramStart"/>
-      <w:r>
-        <w:t>2026 -</w:t>
-      </w:r>
-      <w:proofErr w:type="gramEnd"/>
-      <w:r>
-        <w:t xml:space="preserve"> 2027</w:t>
-      </w:r>
-    </w:p>
-    <w:p>
-      <w:pPr>
-        <w:numPr>
-          <w:ilvl w:val="0"/>
-          <w:numId w:val="1"/>
-        </w:numPr>
-      </w:pPr>
-      <w:r>
-        <w:t xml:space="preserve">Bilimsel Yöntem ve Çalışma Basamakları | Dr. Biyoloji | Dönem </w:t>
-      </w:r>
-      <w:proofErr w:type="gramStart"/>
-      <w:r>
-        <w:t>2026 -</w:t>
-      </w:r>
-      <w:proofErr w:type="gramEnd"/>
-      <w:r>
-        <w:t xml:space="preserve"> 2027</w:t>
-      </w:r>
-    </w:p>
-    <w:p>
-      <w:pPr>
-        <w:numPr>
-          <w:ilvl w:val="0"/>
-          <w:numId w:val="1"/>
-        </w:numPr>
-      </w:pPr>
-      <w:r>
-        <w:t xml:space="preserve">Hücre Zarı ve Bilimsel Çalışma </w:t>
-      </w:r>
+        <w:t xml:space="preserve"> (8:53)</w:t>
+      </w:r>
+    </w:p>
+    <w:p>
+      <w:pPr>
+        <w:numPr>
+          <w:ilvl w:val="0"/>
+          <w:numId w:val="2"/>
+        </w:numPr>
+      </w:pPr>
+      <w:r>
+        <w:rPr>
+          <w:b/>
+          <w:bCs/>
+        </w:rPr>
+        <w:t>Kalıtıma Giriş</w:t>
+      </w:r>
+      <w:r>
+        <w:t xml:space="preserve"> (17:51)</w:t>
+      </w:r>
+    </w:p>
+    <w:p>
+      <w:pPr>
+        <w:numPr>
+          <w:ilvl w:val="0"/>
+          <w:numId w:val="2"/>
+        </w:numPr>
+      </w:pPr>
       <w:proofErr w:type="spellStart"/>
       <w:r>
+        <w:rPr>
+          <w:b/>
+          <w:bCs/>
+        </w:rPr>
+        <w:t>Mendel</w:t>
+      </w:r>
+      <w:proofErr w:type="spellEnd"/>
+      <w:r>
+        <w:rPr>
+          <w:b/>
+          <w:bCs/>
+        </w:rPr>
+        <w:t xml:space="preserve"> Genetiği</w:t>
+      </w:r>
+      <w:r>
+        <w:t xml:space="preserve"> (10:25)</w:t>
+      </w:r>
+    </w:p>
+    <w:p>
+      <w:pPr>
+        <w:numPr>
+          <w:ilvl w:val="0"/>
+          <w:numId w:val="2"/>
+        </w:numPr>
+      </w:pPr>
+      <w:proofErr w:type="spellStart"/>
+      <w:r>
+        <w:rPr>
+          <w:b/>
+          <w:bCs/>
+        </w:rPr>
+        <w:t>Mendel'den</w:t>
+      </w:r>
+      <w:proofErr w:type="spellEnd"/>
+      <w:r>
+        <w:rPr>
+          <w:b/>
+          <w:bCs/>
+        </w:rPr>
+        <w:t xml:space="preserve"> Sapmalar</w:t>
+      </w:r>
+      <w:r>
+        <w:t xml:space="preserve"> (15:25)</w:t>
+      </w:r>
+    </w:p>
+    <w:p>
+      <w:pPr>
+        <w:numPr>
+          <w:ilvl w:val="0"/>
+          <w:numId w:val="2"/>
+        </w:numPr>
+      </w:pPr>
+      <w:r>
+        <w:rPr>
+          <w:b/>
+          <w:bCs/>
+        </w:rPr>
+        <w:t>Eşeyin Belirlenmesi X ve Y Kromozomları</w:t>
+      </w:r>
+      <w:r>
+        <w:t xml:space="preserve"> (11:42)</w:t>
+      </w:r>
+    </w:p>
+    <w:p>
+      <w:pPr>
+        <w:numPr>
+          <w:ilvl w:val="0"/>
+          <w:numId w:val="2"/>
+        </w:numPr>
+      </w:pPr>
+      <w:r>
+        <w:rPr>
+          <w:b/>
+          <w:bCs/>
+        </w:rPr>
+        <w:t>Kan Grupları</w:t>
+      </w:r>
+      <w:r>
+        <w:t xml:space="preserve"> (6:22)</w:t>
+      </w:r>
+    </w:p>
+    <w:p>
+      <w:pPr>
+        <w:numPr>
+          <w:ilvl w:val="0"/>
+          <w:numId w:val="2"/>
+        </w:numPr>
+      </w:pPr>
+      <w:r>
+        <w:rPr>
+          <w:b/>
+          <w:bCs/>
+        </w:rPr>
+        <w:t>Genetik Çeşitlilik</w:t>
+      </w:r>
+      <w:r>
+        <w:t xml:space="preserve"> (28:07)</w:t>
+      </w:r>
+    </w:p>
+    <w:p>
+      <w:pPr>
+        <w:numPr>
+          <w:ilvl w:val="0"/>
+          <w:numId w:val="2"/>
+        </w:numPr>
+      </w:pPr>
+      <w:r>
+        <w:rPr>
+          <w:b/>
+          <w:bCs/>
+        </w:rPr>
+        <w:t xml:space="preserve">Kalıtım </w:t>
+      </w:r>
+      <w:proofErr w:type="spellStart"/>
+      <w:r>
+        <w:rPr>
+          <w:b/>
+          <w:bCs/>
+        </w:rPr>
         <w:t>Checkpoint</w:t>
       </w:r>
       <w:proofErr w:type="spellEnd"/>
       <w:r>
-        <w:t xml:space="preserve"> | Biyoloji 2026-2027 | Dr. Biyoloji</w:t>
-      </w:r>
-    </w:p>
-    <w:p>
-      <w:pPr>
-        <w:numPr>
-          <w:ilvl w:val="0"/>
-          <w:numId w:val="1"/>
-        </w:numPr>
-      </w:pPr>
-      <w:r>
-        <w:t xml:space="preserve">Canlıların Sınıflandırılması | Dr. Biyoloji | Dönem </w:t>
-      </w:r>
-      <w:proofErr w:type="gramStart"/>
-      <w:r>
-        <w:t>2026 -</w:t>
-      </w:r>
-      <w:proofErr w:type="gramEnd"/>
-      <w:r>
-        <w:t xml:space="preserve"> 2027</w:t>
-      </w:r>
-    </w:p>
-    <w:p>
-      <w:pPr>
-        <w:numPr>
-          <w:ilvl w:val="0"/>
-          <w:numId w:val="1"/>
-        </w:numPr>
-      </w:pPr>
-      <w:r>
-        <w:t xml:space="preserve">Bakteri ve Arke | Dr. Biyoloji | Dönem </w:t>
-      </w:r>
-      <w:proofErr w:type="gramStart"/>
-      <w:r>
-        <w:t>2026 -</w:t>
-      </w:r>
-      <w:proofErr w:type="gramEnd"/>
-      <w:r>
-        <w:t xml:space="preserve"> 2027</w:t>
-      </w:r>
-    </w:p>
-    <w:p>
-      <w:pPr>
-        <w:numPr>
-          <w:ilvl w:val="0"/>
-          <w:numId w:val="1"/>
-        </w:numPr>
-      </w:pPr>
-      <w:r>
-        <w:t xml:space="preserve">Bakteri ve Arke </w:t>
+        <w:t xml:space="preserve"> (8:20)</w:t>
+      </w:r>
+    </w:p>
+    <w:p>
+      <w:pPr>
+        <w:numPr>
+          <w:ilvl w:val="0"/>
+          <w:numId w:val="2"/>
+        </w:numPr>
+      </w:pPr>
+      <w:r>
+        <w:rPr>
+          <w:b/>
+          <w:bCs/>
+        </w:rPr>
+        <w:t>Ekoloji Giriş</w:t>
+      </w:r>
+      <w:r>
+        <w:t xml:space="preserve"> (12:10)</w:t>
+      </w:r>
+    </w:p>
+    <w:p>
+      <w:pPr>
+        <w:numPr>
+          <w:ilvl w:val="0"/>
+          <w:numId w:val="2"/>
+        </w:numPr>
+      </w:pPr>
+      <w:r>
+        <w:rPr>
+          <w:b/>
+          <w:bCs/>
+        </w:rPr>
+        <w:t>Besin Piramidi</w:t>
+      </w:r>
+      <w:r>
+        <w:t xml:space="preserve"> (11:09)</w:t>
+      </w:r>
+    </w:p>
+    <w:p>
+      <w:pPr>
+        <w:numPr>
+          <w:ilvl w:val="0"/>
+          <w:numId w:val="2"/>
+        </w:numPr>
+      </w:pPr>
+      <w:r>
+        <w:rPr>
+          <w:b/>
+          <w:bCs/>
+        </w:rPr>
+        <w:t>Besin Zinciri ve Ağı</w:t>
+      </w:r>
+      <w:r>
+        <w:t xml:space="preserve"> (14:38)</w:t>
+      </w:r>
+    </w:p>
+    <w:p>
+      <w:pPr>
+        <w:numPr>
+          <w:ilvl w:val="0"/>
+          <w:numId w:val="2"/>
+        </w:numPr>
+      </w:pPr>
+      <w:r>
+        <w:rPr>
+          <w:b/>
+          <w:bCs/>
+        </w:rPr>
+        <w:t xml:space="preserve">Ekoloji </w:t>
       </w:r>
       <w:proofErr w:type="spellStart"/>
       <w:r>
+        <w:rPr>
+          <w:b/>
+          <w:bCs/>
+        </w:rPr>
         <w:t>Checkpoint</w:t>
       </w:r>
       <w:proofErr w:type="spellEnd"/>
       <w:r>
-        <w:t xml:space="preserve"> | Biyoloji 2026-2027 | Dr. Biyoloji</w:t>
-      </w:r>
-    </w:p>
-    <w:p>
-      <w:pPr>
-        <w:numPr>
-          <w:ilvl w:val="0"/>
-          <w:numId w:val="1"/>
-        </w:numPr>
-      </w:pPr>
+        <w:t xml:space="preserve"> (8:50)</w:t>
+      </w:r>
+    </w:p>
+    <w:p>
+      <w:pPr>
+        <w:numPr>
+          <w:ilvl w:val="0"/>
+          <w:numId w:val="2"/>
+        </w:numPr>
+      </w:pPr>
+      <w:r>
+        <w:rPr>
+          <w:b/>
+          <w:bCs/>
+        </w:rPr>
+        <w:t>Madde Döngüleri</w:t>
+      </w:r>
+      <w:r>
+        <w:t xml:space="preserve"> (11:07)</w:t>
+      </w:r>
+    </w:p>
+    <w:p>
+      <w:pPr>
+        <w:numPr>
+          <w:ilvl w:val="0"/>
+          <w:numId w:val="2"/>
+        </w:numPr>
+      </w:pPr>
+      <w:r>
+        <w:rPr>
+          <w:b/>
+          <w:bCs/>
+        </w:rPr>
+        <w:t>Güncel Çevre Sorunları</w:t>
+      </w:r>
+      <w:r>
+        <w:t xml:space="preserve"> (14:18)</w:t>
+      </w:r>
+    </w:p>
+    <w:p>
+      <w:pPr>
+        <w:numPr>
+          <w:ilvl w:val="0"/>
+          <w:numId w:val="2"/>
+        </w:numPr>
+      </w:pPr>
+      <w:r>
+        <w:rPr>
+          <w:b/>
+          <w:bCs/>
+        </w:rPr>
+        <w:t xml:space="preserve">Döngüler ve Kirlilik </w:t>
+      </w:r>
       <w:proofErr w:type="spellStart"/>
       <w:r>
-        <w:t>Protista</w:t>
+        <w:rPr>
+          <w:b/>
+          <w:bCs/>
+        </w:rPr>
+        <w:t>Checkpoint</w:t>
       </w:r>
       <w:proofErr w:type="spellEnd"/>
       <w:r>
-        <w:t xml:space="preserve"> | Dr. Biyoloji | Dönem </w:t>
-      </w:r>
-      <w:proofErr w:type="gramStart"/>
-      <w:r>
-        <w:t>2026 -</w:t>
-      </w:r>
-      <w:proofErr w:type="gramEnd"/>
-      <w:r>
-        <w:t xml:space="preserve"> 2027</w:t>
-      </w:r>
-    </w:p>
-    <w:p>
-      <w:pPr>
-        <w:numPr>
-          <w:ilvl w:val="0"/>
-          <w:numId w:val="1"/>
-        </w:numPr>
-      </w:pPr>
-      <w:r>
-        <w:t xml:space="preserve">Bitki | Dr. Biyoloji | Dönem </w:t>
-      </w:r>
-      <w:proofErr w:type="gramStart"/>
-      <w:r>
-        <w:t>2026 -</w:t>
-      </w:r>
-      <w:proofErr w:type="gramEnd"/>
-      <w:r>
-        <w:t xml:space="preserve"> 2027</w:t>
-      </w:r>
-    </w:p>
-    <w:p>
-      <w:pPr>
-        <w:numPr>
-          <w:ilvl w:val="0"/>
-          <w:numId w:val="1"/>
-        </w:numPr>
-      </w:pPr>
-      <w:r>
-        <w:t xml:space="preserve">Mantar | Dr. Biyoloji | Dönem </w:t>
-      </w:r>
-      <w:proofErr w:type="gramStart"/>
-      <w:r>
-        <w:t>2026 -</w:t>
-      </w:r>
-      <w:proofErr w:type="gramEnd"/>
-      <w:r>
-        <w:t xml:space="preserve"> 2027</w:t>
-      </w:r>
-    </w:p>
-    <w:p>
-      <w:pPr>
-        <w:numPr>
-          <w:ilvl w:val="0"/>
-          <w:numId w:val="1"/>
-        </w:numPr>
-      </w:pPr>
-      <w:proofErr w:type="spellStart"/>
-      <w:r>
-        <w:t>Protista</w:t>
-      </w:r>
-      <w:proofErr w:type="spellEnd"/>
-      <w:r>
-        <w:t xml:space="preserve">, Bitki ve Mantar </w:t>
-      </w:r>
-      <w:proofErr w:type="spellStart"/>
-      <w:r>
-        <w:t>Checkpoint</w:t>
-      </w:r>
-      <w:proofErr w:type="spellEnd"/>
-      <w:r>
-        <w:t xml:space="preserve"> | Biyoloji 2026-2027 | Dr. Biyoloji</w:t>
-      </w:r>
-    </w:p>
-    <w:p>
-      <w:pPr>
-        <w:numPr>
-          <w:ilvl w:val="0"/>
-          <w:numId w:val="1"/>
-        </w:numPr>
-      </w:pPr>
-      <w:r>
-        <w:t xml:space="preserve">Omurgasızlar | Dr. Biyoloji | Dönem </w:t>
-      </w:r>
-      <w:proofErr w:type="gramStart"/>
-      <w:r>
-        <w:t>2026 -</w:t>
-      </w:r>
-      <w:proofErr w:type="gramEnd"/>
-      <w:r>
-        <w:t xml:space="preserve"> 2027</w:t>
-      </w:r>
-    </w:p>
-    <w:p>
-      <w:pPr>
-        <w:numPr>
-          <w:ilvl w:val="0"/>
-          <w:numId w:val="1"/>
-        </w:numPr>
-      </w:pPr>
-      <w:r>
-        <w:t xml:space="preserve">Omurgalılar | Dr. Biyoloji | Dönem </w:t>
-      </w:r>
-      <w:proofErr w:type="gramStart"/>
-      <w:r>
-        <w:t>2026 -</w:t>
-      </w:r>
-      <w:proofErr w:type="gramEnd"/>
-      <w:r>
-        <w:t xml:space="preserve"> 2027</w:t>
-      </w:r>
-    </w:p>
-    <w:p>
-      <w:pPr>
-        <w:numPr>
-          <w:ilvl w:val="0"/>
-          <w:numId w:val="1"/>
-        </w:numPr>
-      </w:pPr>
-      <w:r>
-        <w:t xml:space="preserve">Hayvanlar </w:t>
-      </w:r>
-      <w:proofErr w:type="spellStart"/>
-      <w:r>
-        <w:t>Checkpoint</w:t>
-      </w:r>
-      <w:proofErr w:type="spellEnd"/>
-      <w:r>
-        <w:t xml:space="preserve"> | Biyoloji 2026-2027 | Dr. Biyoloji</w:t>
-      </w:r>
-    </w:p>
-    <w:p>
-      <w:pPr>
-        <w:numPr>
-          <w:ilvl w:val="0"/>
-          <w:numId w:val="1"/>
-        </w:numPr>
-      </w:pPr>
-      <w:r>
-        <w:t xml:space="preserve">Hücre </w:t>
-      </w:r>
-      <w:proofErr w:type="gramStart"/>
-      <w:r>
-        <w:t>Bölünmeleri -</w:t>
-      </w:r>
-      <w:proofErr w:type="gramEnd"/>
-      <w:r>
-        <w:t xml:space="preserve"> Mitoz | Dr. Biyoloji | Dönem </w:t>
-      </w:r>
-      <w:proofErr w:type="gramStart"/>
-      <w:r>
-        <w:t>2026 -</w:t>
-      </w:r>
-      <w:proofErr w:type="gramEnd"/>
-      <w:r>
-        <w:t xml:space="preserve"> 2027</w:t>
-      </w:r>
-    </w:p>
-    <w:p>
-      <w:pPr>
-        <w:numPr>
-          <w:ilvl w:val="0"/>
-          <w:numId w:val="1"/>
-        </w:numPr>
-      </w:pPr>
-      <w:r>
-        <w:t xml:space="preserve">Mitoz </w:t>
-      </w:r>
-      <w:proofErr w:type="spellStart"/>
-      <w:r>
-        <w:t>Checkpoint</w:t>
-      </w:r>
-      <w:proofErr w:type="spellEnd"/>
-      <w:r>
-        <w:t xml:space="preserve"> | Dr. Biyoloji | Dönem </w:t>
-      </w:r>
-      <w:proofErr w:type="gramStart"/>
-      <w:r>
-        <w:t>2026 -</w:t>
-      </w:r>
-      <w:proofErr w:type="gramEnd"/>
-      <w:r>
-        <w:t xml:space="preserve"> 2027</w:t>
-      </w:r>
-    </w:p>
-    <w:p>
-      <w:pPr>
-        <w:numPr>
-          <w:ilvl w:val="0"/>
-          <w:numId w:val="1"/>
-        </w:numPr>
-      </w:pPr>
-      <w:r>
-        <w:t xml:space="preserve">Hücre </w:t>
-      </w:r>
-      <w:proofErr w:type="gramStart"/>
-      <w:r>
-        <w:t>Bölünmeleri -</w:t>
-      </w:r>
-      <w:proofErr w:type="gramEnd"/>
-      <w:r>
-        <w:t xml:space="preserve"> Mayoz | Dr. Biyoloji | Dönem </w:t>
-      </w:r>
-      <w:proofErr w:type="gramStart"/>
-      <w:r>
-        <w:t>2026 -</w:t>
-      </w:r>
-      <w:proofErr w:type="gramEnd"/>
-      <w:r>
-        <w:t xml:space="preserve"> 2027</w:t>
-      </w:r>
-    </w:p>
-    <w:p>
-      <w:pPr>
-        <w:numPr>
-          <w:ilvl w:val="0"/>
-          <w:numId w:val="1"/>
-        </w:numPr>
-      </w:pPr>
-      <w:r>
-        <w:t xml:space="preserve">Mayoz </w:t>
-      </w:r>
-      <w:proofErr w:type="spellStart"/>
-      <w:r>
-        <w:t>Checkpoint</w:t>
-      </w:r>
-      <w:proofErr w:type="spellEnd"/>
-      <w:r>
-        <w:t xml:space="preserve"> | Dr. Biyoloji | Dönem </w:t>
-      </w:r>
-      <w:proofErr w:type="gramStart"/>
-      <w:r>
-        <w:t>2026 -</w:t>
-      </w:r>
-      <w:proofErr w:type="gramEnd"/>
-      <w:r>
-        <w:t xml:space="preserve"> 2027</w:t>
-      </w:r>
-    </w:p>
-    <w:p>
-      <w:pPr>
-        <w:numPr>
-          <w:ilvl w:val="0"/>
-          <w:numId w:val="1"/>
-        </w:numPr>
-      </w:pPr>
-      <w:r>
-        <w:t xml:space="preserve">Eşeysiz Üreme | Dr. Biyoloji | Dönem </w:t>
-      </w:r>
-      <w:proofErr w:type="gramStart"/>
-      <w:r>
-        <w:t>2026 -</w:t>
-      </w:r>
-      <w:proofErr w:type="gramEnd"/>
-      <w:r>
-        <w:t xml:space="preserve"> 2027</w:t>
-      </w:r>
-    </w:p>
-    <w:p>
-      <w:pPr>
-        <w:numPr>
-          <w:ilvl w:val="0"/>
-          <w:numId w:val="1"/>
-        </w:numPr>
-      </w:pPr>
-      <w:r>
-        <w:t xml:space="preserve">Eşeyli Üreme | Dr. Biyoloji | Dönem </w:t>
-      </w:r>
-      <w:proofErr w:type="gramStart"/>
-      <w:r>
-        <w:t>2026 -</w:t>
-      </w:r>
-      <w:proofErr w:type="gramEnd"/>
-      <w:r>
-        <w:t xml:space="preserve"> 2027</w:t>
-      </w:r>
-    </w:p>
-    <w:p>
-      <w:pPr>
-        <w:numPr>
-          <w:ilvl w:val="0"/>
-          <w:numId w:val="1"/>
-        </w:numPr>
-      </w:pPr>
-      <w:r>
-        <w:t xml:space="preserve">Eşeysiz ve Eşeyli Üreme </w:t>
-      </w:r>
-      <w:proofErr w:type="spellStart"/>
-      <w:r>
-        <w:t>Checkpoint</w:t>
-      </w:r>
-      <w:proofErr w:type="spellEnd"/>
-      <w:r>
-        <w:t xml:space="preserve"> | Dr. Biyoloji | Dönem </w:t>
-      </w:r>
-      <w:proofErr w:type="gramStart"/>
-      <w:r>
-        <w:t>2026 -</w:t>
-      </w:r>
-      <w:proofErr w:type="gramEnd"/>
-      <w:r>
-        <w:t xml:space="preserve"> 2027</w:t>
-      </w:r>
-    </w:p>
-    <w:p>
-      <w:pPr>
-        <w:numPr>
-          <w:ilvl w:val="0"/>
-          <w:numId w:val="1"/>
-        </w:numPr>
-      </w:pPr>
-      <w:r>
-        <w:lastRenderedPageBreak/>
-        <w:t xml:space="preserve">Kalıtıma Giriş | Dr. Biyoloji | Dönem </w:t>
-      </w:r>
-      <w:proofErr w:type="gramStart"/>
-      <w:r>
-        <w:t>2026 -</w:t>
-      </w:r>
-      <w:proofErr w:type="gramEnd"/>
-      <w:r>
-        <w:t xml:space="preserve"> 2027</w:t>
-      </w:r>
-    </w:p>
-    <w:p>
-      <w:pPr>
-        <w:numPr>
-          <w:ilvl w:val="0"/>
-          <w:numId w:val="1"/>
-        </w:numPr>
-      </w:pPr>
-      <w:proofErr w:type="spellStart"/>
-      <w:r>
-        <w:t>Mendel</w:t>
-      </w:r>
-      <w:proofErr w:type="spellEnd"/>
-      <w:r>
-        <w:t xml:space="preserve"> Genetiği | Dr. Biyoloji | Dönem </w:t>
-      </w:r>
-      <w:proofErr w:type="gramStart"/>
-      <w:r>
-        <w:t>2026 -</w:t>
-      </w:r>
-      <w:proofErr w:type="gramEnd"/>
-      <w:r>
-        <w:t xml:space="preserve"> 2027</w:t>
-      </w:r>
-    </w:p>
-    <w:p>
-      <w:pPr>
-        <w:numPr>
-          <w:ilvl w:val="0"/>
-          <w:numId w:val="1"/>
-        </w:numPr>
-      </w:pPr>
-      <w:proofErr w:type="spellStart"/>
-      <w:r>
-        <w:t>Mendel'den</w:t>
-      </w:r>
-      <w:proofErr w:type="spellEnd"/>
-      <w:r>
-        <w:t xml:space="preserve"> Sapmalar | Dr. Biyoloji | Dönem </w:t>
-      </w:r>
-      <w:proofErr w:type="gramStart"/>
-      <w:r>
-        <w:t>2026 -</w:t>
-      </w:r>
-      <w:proofErr w:type="gramEnd"/>
-      <w:r>
-        <w:t xml:space="preserve"> 2027</w:t>
-      </w:r>
-    </w:p>
-    <w:p>
-      <w:pPr>
-        <w:numPr>
-          <w:ilvl w:val="0"/>
-          <w:numId w:val="1"/>
-        </w:numPr>
-      </w:pPr>
-      <w:r>
-        <w:t xml:space="preserve">Eşeyin Belirlenmesi X ve Y Kromozomları | Dr. Biyoloji | Dönem </w:t>
-      </w:r>
-      <w:proofErr w:type="gramStart"/>
-      <w:r>
-        <w:t>2026 -</w:t>
-      </w:r>
-      <w:proofErr w:type="gramEnd"/>
-      <w:r>
-        <w:t xml:space="preserve"> 2027</w:t>
-      </w:r>
-    </w:p>
-    <w:p>
-      <w:pPr>
-        <w:numPr>
-          <w:ilvl w:val="0"/>
-          <w:numId w:val="1"/>
-        </w:numPr>
-      </w:pPr>
-      <w:r>
-        <w:t xml:space="preserve">Kan Grupları | Dr. Biyoloji | Dönem </w:t>
-      </w:r>
-      <w:proofErr w:type="gramStart"/>
-      <w:r>
-        <w:t>2026 -</w:t>
-      </w:r>
-      <w:proofErr w:type="gramEnd"/>
-      <w:r>
-        <w:t xml:space="preserve"> 2027</w:t>
-      </w:r>
-    </w:p>
-    <w:p>
-      <w:pPr>
-        <w:numPr>
-          <w:ilvl w:val="0"/>
-          <w:numId w:val="1"/>
-        </w:numPr>
-      </w:pPr>
-      <w:r>
-        <w:t xml:space="preserve">Genetik Çeşitlilik | Dr. Biyoloji | Dönem </w:t>
-      </w:r>
-      <w:proofErr w:type="gramStart"/>
-      <w:r>
-        <w:t>2026 -</w:t>
-      </w:r>
-      <w:proofErr w:type="gramEnd"/>
-      <w:r>
-        <w:t xml:space="preserve"> 2027</w:t>
-      </w:r>
-    </w:p>
-    <w:p>
-      <w:pPr>
-        <w:numPr>
-          <w:ilvl w:val="0"/>
-          <w:numId w:val="1"/>
-        </w:numPr>
-      </w:pPr>
-      <w:r>
-        <w:t xml:space="preserve">Kalıtım </w:t>
-      </w:r>
-      <w:proofErr w:type="spellStart"/>
-      <w:r>
-        <w:t>Checkpoint</w:t>
-      </w:r>
-      <w:proofErr w:type="spellEnd"/>
-      <w:r>
-        <w:t xml:space="preserve"> | Dr. Biyoloji | Dönem </w:t>
-      </w:r>
-      <w:proofErr w:type="gramStart"/>
-      <w:r>
-        <w:t>2026 -</w:t>
-      </w:r>
-      <w:proofErr w:type="gramEnd"/>
-      <w:r>
-        <w:t xml:space="preserve"> 2027</w:t>
-      </w:r>
-    </w:p>
-    <w:p>
-      <w:pPr>
-        <w:numPr>
-          <w:ilvl w:val="0"/>
-          <w:numId w:val="1"/>
-        </w:numPr>
-      </w:pPr>
-      <w:r>
-        <w:t xml:space="preserve">Ekoloji Giriş | Dr. Biyoloji | Dönem </w:t>
-      </w:r>
-      <w:proofErr w:type="gramStart"/>
-      <w:r>
-        <w:t>2026 -</w:t>
-      </w:r>
-      <w:proofErr w:type="gramEnd"/>
-      <w:r>
-        <w:t xml:space="preserve"> 2027</w:t>
-      </w:r>
-    </w:p>
-    <w:p>
-      <w:pPr>
-        <w:numPr>
-          <w:ilvl w:val="0"/>
-          <w:numId w:val="1"/>
-        </w:numPr>
-      </w:pPr>
-      <w:r>
-        <w:t xml:space="preserve">Besin Piramidi | Dr. Biyoloji | Dönem </w:t>
-      </w:r>
-      <w:proofErr w:type="gramStart"/>
-      <w:r>
-        <w:t>2026 -</w:t>
-      </w:r>
-      <w:proofErr w:type="gramEnd"/>
-      <w:r>
-        <w:t xml:space="preserve"> 2027</w:t>
-      </w:r>
-    </w:p>
-    <w:p>
-      <w:pPr>
-        <w:numPr>
-          <w:ilvl w:val="0"/>
-          <w:numId w:val="1"/>
-        </w:numPr>
-      </w:pPr>
-      <w:r>
-        <w:t xml:space="preserve">Besin Zinciri ve Ağı | Dr. Biyoloji | Dönem </w:t>
-      </w:r>
-      <w:proofErr w:type="gramStart"/>
-      <w:r>
-        <w:t>2026 -</w:t>
-      </w:r>
-      <w:proofErr w:type="gramEnd"/>
-      <w:r>
-        <w:t xml:space="preserve"> 2027</w:t>
-      </w:r>
-    </w:p>
-    <w:p>
-      <w:pPr>
-        <w:numPr>
-          <w:ilvl w:val="0"/>
-          <w:numId w:val="1"/>
-        </w:numPr>
-      </w:pPr>
-      <w:r>
-        <w:t xml:space="preserve">Ekoloji </w:t>
-      </w:r>
-      <w:proofErr w:type="spellStart"/>
-      <w:r>
-        <w:t>Checkpoint</w:t>
-      </w:r>
-      <w:proofErr w:type="spellEnd"/>
-      <w:r>
-        <w:t xml:space="preserve"> | Dr. Biyoloji | Dönem </w:t>
-      </w:r>
-      <w:proofErr w:type="gramStart"/>
-      <w:r>
-        <w:t>2026 -</w:t>
-      </w:r>
-      <w:proofErr w:type="gramEnd"/>
-      <w:r>
-        <w:t xml:space="preserve"> 2027</w:t>
-      </w:r>
-    </w:p>
-    <w:p>
-      <w:pPr>
-        <w:numPr>
-          <w:ilvl w:val="0"/>
-          <w:numId w:val="1"/>
-        </w:numPr>
-      </w:pPr>
-      <w:r>
-        <w:t xml:space="preserve">Madde Döngüleri | Dr. Biyoloji | Dönem </w:t>
-      </w:r>
-      <w:proofErr w:type="gramStart"/>
-      <w:r>
-        <w:t>2026 -</w:t>
-      </w:r>
-      <w:proofErr w:type="gramEnd"/>
-      <w:r>
-        <w:t xml:space="preserve"> 2027</w:t>
-      </w:r>
-    </w:p>
-    <w:p>
-      <w:pPr>
-        <w:numPr>
-          <w:ilvl w:val="0"/>
-          <w:numId w:val="1"/>
-        </w:numPr>
-      </w:pPr>
-      <w:r>
-        <w:t xml:space="preserve">Güncel Çevre Sorunları | Dr. Biyoloji | Dönem </w:t>
-      </w:r>
-      <w:proofErr w:type="gramStart"/>
-      <w:r>
-        <w:t>2026 -</w:t>
-      </w:r>
-      <w:proofErr w:type="gramEnd"/>
-      <w:r>
-        <w:t xml:space="preserve"> 2027</w:t>
-      </w:r>
-    </w:p>
-    <w:p>
-      <w:pPr>
-        <w:numPr>
-          <w:ilvl w:val="0"/>
-          <w:numId w:val="1"/>
-        </w:numPr>
-      </w:pPr>
-      <w:r>
-        <w:t xml:space="preserve">Döngüler ve Kirlilik </w:t>
-      </w:r>
-      <w:proofErr w:type="spellStart"/>
-      <w:r>
-        <w:t>Checkpoint</w:t>
-      </w:r>
-      <w:proofErr w:type="spellEnd"/>
-      <w:r>
-        <w:t xml:space="preserve"> | Dr. Biyoloji | Dönem </w:t>
-      </w:r>
-      <w:proofErr w:type="gramStart"/>
-      <w:r>
-        <w:t>2026 -</w:t>
-      </w:r>
-      <w:proofErr w:type="gramEnd"/>
-      <w:r>
-        <w:t xml:space="preserve"> 2027</w:t>
+        <w:t xml:space="preserve"> </w:t>
+      </w:r>
+      <w:r>
+        <w:rPr>
+          <w:i/>
+          <w:iCs/>
+        </w:rPr>
+        <w:t>(Süre belirtilmemiş)</w:t>
       </w:r>
     </w:p>
     <w:p/>
@@ -899,6 +1259,119 @@
 <file path=word/numbering.xml><?xml version="1.0" encoding="utf-8"?>
 <w:numbering xmlns:wpc="http://schemas.microsoft.com/office/word/2010/wordprocessingCanvas" xmlns:cx="http://schemas.microsoft.com/office/drawing/2014/chartex" xmlns:cx1="http://schemas.microsoft.com/office/drawing/2015/9/8/chartex" xmlns:cx2="http://schemas.microsoft.com/office/drawing/2015/10/21/chartex" xmlns:cx3="http://schemas.microsoft.com/office/drawing/2016/5/9/chartex" xmlns:cx4="http://schemas.microsoft.com/office/drawing/2016/5/10/chartex" xmlns:cx5="http://schemas.microsoft.com/office/drawing/2016/5/11/chartex" xmlns:cx6="http://schemas.microsoft.com/office/drawing/2016/5/12/chartex" xmlns:cx7="http://schemas.microsoft.com/office/drawing/2016/5/13/chartex" xmlns:cx8="http://schemas.microsoft.com/office/drawing/2016/5/14/chartex" xmlns:mc="http://schemas.openxmlformats.org/markup-compatibility/2006" xmlns:aink="http://schemas.microsoft.com/office/drawing/2016/ink" xmlns:am3d="http://schemas.microsoft.com/office/drawing/2017/model3d" xmlns:o="urn:schemas-microsoft-com:office:office" xmlns:oel="http://schemas.microsoft.com/office/2019/extlst" xmlns:r="http://schemas.openxmlformats.org/officeDocument/2006/relationships" xmlns:m="http://schemas.openxmlformats.org/officeDocument/2006/math" xmlns:v="urn:schemas-microsoft-com:vml" xmlns:wp14="http://schemas.microsoft.com/office/word/2010/wordprocessingDrawing" xmlns:wp="http://schemas.openxmlformats.org/drawingml/2006/wordprocessingDrawing" xmlns:w10="urn:schemas-microsoft-com:office:word" xmlns:w="http://schemas.openxmlformats.org/wordprocessingml/2006/main" xmlns:w14="http://schemas.microsoft.com/office/word/2010/wordml" xmlns:w15="http://schemas.microsoft.com/office/word/2012/wordml" xmlns:w16cex="http://schemas.microsoft.com/office/word/2018/wordml/cex" xmlns:w16cid="http://schemas.microsoft.com/office/word/2016/wordml/cid" xmlns:w16="http://schemas.microsoft.com/office/word/2018/wordml" xmlns:w16du="http://schemas.microsoft.com/office/word/2023/wordml/word16du" xmlns:w16sdtdh="http://schemas.microsoft.com/office/word/2020/wordml/sdtdatahash" xmlns:w16sdtfl="http://schemas.microsoft.com/office/word/2024/wordml/sdtformatlock" xmlns:w16se="http://schemas.microsoft.com/office/word/2015/wordml/symex" xmlns:wpg="http://schemas.microsoft.com/office/word/2010/wordprocessingGroup" xmlns:wpi="http://schemas.microsoft.com/office/word/2010/wordprocessingInk" xmlns:wne="http://schemas.microsoft.com/office/word/2006/wordml" xmlns:wps="http://schemas.microsoft.com/office/word/2010/wordprocessingShape" mc:Ignorable="w14 w15 w16se w16cid w16 w16cex w16sdtdh w16sdtfl w16du wp14">
   <w:abstractNum w:abstractNumId="0" w15:restartNumberingAfterBreak="0">
+    <w:nsid w:val="1DD5247B"/>
+    <w:multiLevelType w:val="multilevel"/>
+    <w:tmpl w:val="8CCA88F0"/>
+    <w:lvl w:ilvl="0">
+      <w:start w:val="3"/>
+      <w:numFmt w:val="decimal"/>
+      <w:lvlText w:val="%1."/>
+      <w:lvlJc w:val="left"/>
+      <w:pPr>
+        <w:tabs>
+          <w:tab w:val="num" w:pos="720"/>
+        </w:tabs>
+        <w:ind w:left="720" w:hanging="360"/>
+      </w:pPr>
+    </w:lvl>
+    <w:lvl w:ilvl="1" w:tentative="1">
+      <w:start w:val="1"/>
+      <w:numFmt w:val="decimal"/>
+      <w:lvlText w:val="%2."/>
+      <w:lvlJc w:val="left"/>
+      <w:pPr>
+        <w:tabs>
+          <w:tab w:val="num" w:pos="1440"/>
+        </w:tabs>
+        <w:ind w:left="1440" w:hanging="360"/>
+      </w:pPr>
+    </w:lvl>
+    <w:lvl w:ilvl="2" w:tentative="1">
+      <w:start w:val="1"/>
+      <w:numFmt w:val="decimal"/>
+      <w:lvlText w:val="%3."/>
+      <w:lvlJc w:val="left"/>
+      <w:pPr>
+        <w:tabs>
+          <w:tab w:val="num" w:pos="2160"/>
+        </w:tabs>
+        <w:ind w:left="2160" w:hanging="360"/>
+      </w:pPr>
+    </w:lvl>
+    <w:lvl w:ilvl="3" w:tentative="1">
+      <w:start w:val="1"/>
+      <w:numFmt w:val="decimal"/>
+      <w:lvlText w:val="%4."/>
+      <w:lvlJc w:val="left"/>
+      <w:pPr>
+        <w:tabs>
+          <w:tab w:val="num" w:pos="2880"/>
+        </w:tabs>
+        <w:ind w:left="2880" w:hanging="360"/>
+      </w:pPr>
+    </w:lvl>
+    <w:lvl w:ilvl="4" w:tentative="1">
+      <w:start w:val="1"/>
+      <w:numFmt w:val="decimal"/>
+      <w:lvlText w:val="%5."/>
+      <w:lvlJc w:val="left"/>
+      <w:pPr>
+        <w:tabs>
+          <w:tab w:val="num" w:pos="3600"/>
+        </w:tabs>
+        <w:ind w:left="3600" w:hanging="360"/>
+      </w:pPr>
+    </w:lvl>
+    <w:lvl w:ilvl="5" w:tentative="1">
+      <w:start w:val="1"/>
+      <w:numFmt w:val="decimal"/>
+      <w:lvlText w:val="%6."/>
+      <w:lvlJc w:val="left"/>
+      <w:pPr>
+        <w:tabs>
+          <w:tab w:val="num" w:pos="4320"/>
+        </w:tabs>
+        <w:ind w:left="4320" w:hanging="360"/>
+      </w:pPr>
+    </w:lvl>
+    <w:lvl w:ilvl="6" w:tentative="1">
+      <w:start w:val="1"/>
+      <w:numFmt w:val="decimal"/>
+      <w:lvlText w:val="%7."/>
+      <w:lvlJc w:val="left"/>
+      <w:pPr>
+        <w:tabs>
+          <w:tab w:val="num" w:pos="5040"/>
+        </w:tabs>
+        <w:ind w:left="5040" w:hanging="360"/>
+      </w:pPr>
+    </w:lvl>
+    <w:lvl w:ilvl="7" w:tentative="1">
+      <w:start w:val="1"/>
+      <w:numFmt w:val="decimal"/>
+      <w:lvlText w:val="%8."/>
+      <w:lvlJc w:val="left"/>
+      <w:pPr>
+        <w:tabs>
+          <w:tab w:val="num" w:pos="5760"/>
+        </w:tabs>
+        <w:ind w:left="5760" w:hanging="360"/>
+      </w:pPr>
+    </w:lvl>
+    <w:lvl w:ilvl="8" w:tentative="1">
+      <w:start w:val="1"/>
+      <w:numFmt w:val="decimal"/>
+      <w:lvlText w:val="%9."/>
+      <w:lvlJc w:val="left"/>
+      <w:pPr>
+        <w:tabs>
+          <w:tab w:val="num" w:pos="6480"/>
+        </w:tabs>
+        <w:ind w:left="6480" w:hanging="360"/>
+      </w:pPr>
+    </w:lvl>
+  </w:abstractNum>
+  <w:abstractNum w:abstractNumId="1" w15:restartNumberingAfterBreak="0">
     <w:nsid w:val="39EF50B7"/>
     <w:multiLevelType w:val="multilevel"/>
     <w:tmpl w:val="64D8364E"/>
@@ -1012,6 +1485,9 @@
     </w:lvl>
   </w:abstractNum>
   <w:num w:numId="1" w16cid:durableId="1826780419">
+    <w:abstractNumId w:val="1"/>
+  </w:num>
+  <w:num w:numId="2" w16cid:durableId="63798618">
     <w:abstractNumId w:val="0"/>
   </w:num>
 </w:numbering>
@@ -1491,7 +1967,6 @@
     <w:next w:val="Normal"/>
     <w:link w:val="Balk4Char"/>
     <w:uiPriority w:val="9"/>
-    <w:semiHidden/>
     <w:unhideWhenUsed/>
     <w:qFormat/>
     <w:rsid w:val="00BE3215"/>
@@ -1689,7 +2164,6 @@
     <w:basedOn w:val="VarsaylanParagrafYazTipi"/>
     <w:link w:val="Balk4"/>
     <w:uiPriority w:val="9"/>
-    <w:semiHidden/>
     <w:rsid w:val="00BE3215"/>
     <w:rPr>
       <w:rFonts w:eastAsiaTheme="majorEastAsia" w:cstheme="majorBidi"/>
@@ -1931,6 +2405,65 @@
       <w:smallCaps/>
       <w:color w:val="0F4761" w:themeColor="accent1" w:themeShade="BF"/>
       <w:spacing w:val="5"/>
+    </w:rPr>
+  </w:style>
+  <w:style w:type="paragraph" w:customStyle="1" w:styleId="msonormal0">
+    <w:name w:val="msonormal"/>
+    <w:basedOn w:val="Normal"/>
+    <w:rsid w:val="00716FF4"/>
+    <w:pPr>
+      <w:spacing w:before="100" w:beforeAutospacing="1" w:after="100" w:afterAutospacing="1" w:line="240" w:lineRule="auto"/>
+    </w:pPr>
+    <w:rPr>
+      <w:rFonts w:ascii="Times New Roman" w:eastAsia="Times New Roman" w:hAnsi="Times New Roman" w:cs="Times New Roman"/>
+      <w:kern w:val="0"/>
+      <w:lang w:eastAsia="tr-TR"/>
+      <w14:ligatures w14:val="none"/>
+    </w:rPr>
+  </w:style>
+  <w:style w:type="character" w:styleId="Kpr">
+    <w:name w:val="Hyperlink"/>
+    <w:basedOn w:val="VarsaylanParagrafYazTipi"/>
+    <w:uiPriority w:val="99"/>
+    <w:unhideWhenUsed/>
+    <w:rsid w:val="00716FF4"/>
+    <w:rPr>
+      <w:color w:val="0000FF"/>
+      <w:u w:val="single"/>
+    </w:rPr>
+  </w:style>
+  <w:style w:type="character" w:styleId="zlenenKpr">
+    <w:name w:val="FollowedHyperlink"/>
+    <w:basedOn w:val="VarsaylanParagrafYazTipi"/>
+    <w:uiPriority w:val="99"/>
+    <w:semiHidden/>
+    <w:unhideWhenUsed/>
+    <w:rsid w:val="00716FF4"/>
+    <w:rPr>
+      <w:color w:val="800080"/>
+      <w:u w:val="single"/>
+    </w:rPr>
+  </w:style>
+  <w:style w:type="character" w:customStyle="1" w:styleId="style-scope">
+    <w:name w:val="style-scope"/>
+    <w:basedOn w:val="VarsaylanParagrafYazTipi"/>
+    <w:rsid w:val="00716FF4"/>
+  </w:style>
+  <w:style w:type="character" w:customStyle="1" w:styleId="yt-icon-shape">
+    <w:name w:val="yt-icon-shape"/>
+    <w:basedOn w:val="VarsaylanParagrafYazTipi"/>
+    <w:rsid w:val="00716FF4"/>
+  </w:style>
+  <w:style w:type="character" w:styleId="zmlenmeyenBahsetme">
+    <w:name w:val="Unresolved Mention"/>
+    <w:basedOn w:val="VarsaylanParagrafYazTipi"/>
+    <w:uiPriority w:val="99"/>
+    <w:semiHidden/>
+    <w:unhideWhenUsed/>
+    <w:rsid w:val="00716FF4"/>
+    <w:rPr>
+      <w:color w:val="605E5C"/>
+      <w:shd w:val="clear" w:color="auto" w:fill="E1DFDD"/>
     </w:rPr>
   </w:style>
 </w:styles>

</xml_diff>